<commit_message>
fix(i18n): show the stored anonymous name in the reader's language; English manual uses English demo posts
Anonymous posts are stored as the word 익명 (comefollowme convention, also in
existing data); authorLabel translates it at display time in all 7 places.
English screenshots now show English questions, replies, verse note and lesson text.

Co-Authored-By: Claude Opus 5.5 <noreply@anthropic.com>
</commit_message>
<xml_diff>
--- a/사용설명서(사용자용)/곡반정와드_사용설명서_English.docx
+++ b/사용설명서(사용자용)/곡반정와드_사용설명서_English.docx
@@ -107,7 +107,7 @@
       <w:pPr>
         <w:pStyle w:val="1"/>
       </w:pPr>
-      <w:bookmarkStart w:id="0" w:name="_Toc241447888"/>
+      <w:bookmarkStart w:id="0" w:name="_Toc241449949"/>
       <w:r>
         <w:t>Contents</w:t>
       </w:r>
@@ -116,7 +116,7 @@
     <w:sdt>
       <w:sdtPr>
         <w:alias w:val="Contents"/>
-        <w:id w:val="1204758877"/>
+        <w:id w:val="1268036851"/>
       </w:sdtPr>
       <w:sdtEndPr/>
       <w:sdtContent>
@@ -139,7 +139,7 @@
           <w:r>
             <w:fldChar w:fldCharType="separate"/>
           </w:r>
-          <w:hyperlink w:anchor="_Toc241447888" w:history="1">
+          <w:hyperlink w:anchor="_Toc241449949" w:history="1">
             <w:r>
               <w:rPr>
                 <w:rStyle w:val="a5"/>
@@ -163,7 +163,7 @@
               <w:rPr>
                 <w:noProof/>
               </w:rPr>
-              <w:instrText xml:space="preserve"> PAGEREF _Toc241447888 \h </w:instrText>
+              <w:instrText xml:space="preserve"> PAGEREF _Toc241449949 \h </w:instrText>
             </w:r>
             <w:r>
               <w:rPr>
@@ -200,7 +200,7 @@
               <w:noProof/>
             </w:rPr>
           </w:pPr>
-          <w:hyperlink w:anchor="_Toc241447889" w:history="1">
+          <w:hyperlink w:anchor="_Toc241449950" w:history="1">
             <w:r>
               <w:rPr>
                 <w:rStyle w:val="a5"/>
@@ -224,7 +224,7 @@
               <w:rPr>
                 <w:noProof/>
               </w:rPr>
-              <w:instrText xml:space="preserve"> PAGEREF _Toc241447889 \h </w:instrText>
+              <w:instrText xml:space="preserve"> PAGEREF _Toc241449950 \h </w:instrText>
             </w:r>
             <w:r>
               <w:rPr>
@@ -262,7 +262,7 @@
               <w:noProof/>
             </w:rPr>
           </w:pPr>
-          <w:hyperlink w:anchor="_Toc241447890" w:history="1">
+          <w:hyperlink w:anchor="_Toc241449951" w:history="1">
             <w:r>
               <w:rPr>
                 <w:rStyle w:val="a5"/>
@@ -286,7 +286,7 @@
               <w:rPr>
                 <w:noProof/>
               </w:rPr>
-              <w:instrText xml:space="preserve"> PAGEREF _Toc241447890 \h </w:instrText>
+              <w:instrText xml:space="preserve"> PAGEREF _Toc241449951 \h </w:instrText>
             </w:r>
             <w:r>
               <w:rPr>
@@ -324,7 +324,7 @@
               <w:noProof/>
             </w:rPr>
           </w:pPr>
-          <w:hyperlink w:anchor="_Toc241447891" w:history="1">
+          <w:hyperlink w:anchor="_Toc241449952" w:history="1">
             <w:r>
               <w:rPr>
                 <w:rStyle w:val="a5"/>
@@ -348,7 +348,7 @@
               <w:rPr>
                 <w:noProof/>
               </w:rPr>
-              <w:instrText xml:space="preserve"> PAGEREF _Toc241447891 \h </w:instrText>
+              <w:instrText xml:space="preserve"> PAGEREF _Toc241449952 \h </w:instrText>
             </w:r>
             <w:r>
               <w:rPr>
@@ -386,7 +386,7 @@
               <w:noProof/>
             </w:rPr>
           </w:pPr>
-          <w:hyperlink w:anchor="_Toc241447892" w:history="1">
+          <w:hyperlink w:anchor="_Toc241449953" w:history="1">
             <w:r>
               <w:rPr>
                 <w:rStyle w:val="a5"/>
@@ -410,7 +410,7 @@
               <w:rPr>
                 <w:noProof/>
               </w:rPr>
-              <w:instrText xml:space="preserve"> PAGEREF _Toc241447892 \h </w:instrText>
+              <w:instrText xml:space="preserve"> PAGEREF _Toc241449953 \h </w:instrText>
             </w:r>
             <w:r>
               <w:rPr>
@@ -448,7 +448,7 @@
               <w:noProof/>
             </w:rPr>
           </w:pPr>
-          <w:hyperlink w:anchor="_Toc241447893" w:history="1">
+          <w:hyperlink w:anchor="_Toc241449954" w:history="1">
             <w:r>
               <w:rPr>
                 <w:rStyle w:val="a5"/>
@@ -472,7 +472,7 @@
               <w:rPr>
                 <w:noProof/>
               </w:rPr>
-              <w:instrText xml:space="preserve"> PAGEREF _Toc241447893 \h </w:instrText>
+              <w:instrText xml:space="preserve"> PAGEREF _Toc241449954 \h </w:instrText>
             </w:r>
             <w:r>
               <w:rPr>
@@ -510,7 +510,7 @@
               <w:noProof/>
             </w:rPr>
           </w:pPr>
-          <w:hyperlink w:anchor="_Toc241447894" w:history="1">
+          <w:hyperlink w:anchor="_Toc241449955" w:history="1">
             <w:r>
               <w:rPr>
                 <w:rStyle w:val="a5"/>
@@ -534,7 +534,7 @@
               <w:rPr>
                 <w:noProof/>
               </w:rPr>
-              <w:instrText xml:space="preserve"> PAGEREF _Toc241447894 \h </w:instrText>
+              <w:instrText xml:space="preserve"> PAGEREF _Toc241449955 \h </w:instrText>
             </w:r>
             <w:r>
               <w:rPr>
@@ -572,7 +572,7 @@
               <w:noProof/>
             </w:rPr>
           </w:pPr>
-          <w:hyperlink w:anchor="_Toc241447895" w:history="1">
+          <w:hyperlink w:anchor="_Toc241449956" w:history="1">
             <w:r>
               <w:rPr>
                 <w:rStyle w:val="a5"/>
@@ -596,7 +596,7 @@
               <w:rPr>
                 <w:noProof/>
               </w:rPr>
-              <w:instrText xml:space="preserve"> PAGEREF _Toc241447895 \h </w:instrText>
+              <w:instrText xml:space="preserve"> PAGEREF _Toc241449956 \h </w:instrText>
             </w:r>
             <w:r>
               <w:rPr>
@@ -634,7 +634,7 @@
               <w:noProof/>
             </w:rPr>
           </w:pPr>
-          <w:hyperlink w:anchor="_Toc241447896" w:history="1">
+          <w:hyperlink w:anchor="_Toc241449957" w:history="1">
             <w:r>
               <w:rPr>
                 <w:rStyle w:val="a5"/>
@@ -658,7 +658,7 @@
               <w:rPr>
                 <w:noProof/>
               </w:rPr>
-              <w:instrText xml:space="preserve"> PAGEREF _Toc241447896 \h </w:instrText>
+              <w:instrText xml:space="preserve"> PAGEREF _Toc241449957 \h </w:instrText>
             </w:r>
             <w:r>
               <w:rPr>
@@ -696,7 +696,7 @@
               <w:noProof/>
             </w:rPr>
           </w:pPr>
-          <w:hyperlink w:anchor="_Toc241447897" w:history="1">
+          <w:hyperlink w:anchor="_Toc241449958" w:history="1">
             <w:r>
               <w:rPr>
                 <w:rStyle w:val="a5"/>
@@ -720,7 +720,7 @@
               <w:rPr>
                 <w:noProof/>
               </w:rPr>
-              <w:instrText xml:space="preserve"> PAGEREF _Toc241447897 \h </w:instrText>
+              <w:instrText xml:space="preserve"> PAGEREF _Toc241449958 \h </w:instrText>
             </w:r>
             <w:r>
               <w:rPr>
@@ -758,7 +758,7 @@
               <w:noProof/>
             </w:rPr>
           </w:pPr>
-          <w:hyperlink w:anchor="_Toc241447898" w:history="1">
+          <w:hyperlink w:anchor="_Toc241449959" w:history="1">
             <w:r>
               <w:rPr>
                 <w:rStyle w:val="a5"/>
@@ -782,7 +782,7 @@
               <w:rPr>
                 <w:noProof/>
               </w:rPr>
-              <w:instrText xml:space="preserve"> PAGEREF _Toc241447898 \h </w:instrText>
+              <w:instrText xml:space="preserve"> PAGEREF _Toc241449959 \h </w:instrText>
             </w:r>
             <w:r>
               <w:rPr>
@@ -820,7 +820,7 @@
               <w:noProof/>
             </w:rPr>
           </w:pPr>
-          <w:hyperlink w:anchor="_Toc241447899" w:history="1">
+          <w:hyperlink w:anchor="_Toc241449960" w:history="1">
             <w:r>
               <w:rPr>
                 <w:rStyle w:val="a5"/>
@@ -844,7 +844,7 @@
               <w:rPr>
                 <w:noProof/>
               </w:rPr>
-              <w:instrText xml:space="preserve"> PAGEREF _Toc241447899 \h </w:instrText>
+              <w:instrText xml:space="preserve"> PAGEREF _Toc241449960 \h </w:instrText>
             </w:r>
             <w:r>
               <w:rPr>
@@ -882,7 +882,7 @@
               <w:noProof/>
             </w:rPr>
           </w:pPr>
-          <w:hyperlink w:anchor="_Toc241447900" w:history="1">
+          <w:hyperlink w:anchor="_Toc241449961" w:history="1">
             <w:r>
               <w:rPr>
                 <w:rStyle w:val="a5"/>
@@ -906,7 +906,7 @@
               <w:rPr>
                 <w:noProof/>
               </w:rPr>
-              <w:instrText xml:space="preserve"> PAGEREF _Toc241447900 \h </w:instrText>
+              <w:instrText xml:space="preserve"> PAGEREF _Toc241449961 \h </w:instrText>
             </w:r>
             <w:r>
               <w:rPr>
@@ -944,7 +944,7 @@
               <w:noProof/>
             </w:rPr>
           </w:pPr>
-          <w:hyperlink w:anchor="_Toc241447901" w:history="1">
+          <w:hyperlink w:anchor="_Toc241449962" w:history="1">
             <w:r>
               <w:rPr>
                 <w:rStyle w:val="a5"/>
@@ -968,7 +968,7 @@
               <w:rPr>
                 <w:noProof/>
               </w:rPr>
-              <w:instrText xml:space="preserve"> PAGEREF _Toc241447901 \h </w:instrText>
+              <w:instrText xml:space="preserve"> PAGEREF _Toc241449962 \h </w:instrText>
             </w:r>
             <w:r>
               <w:rPr>
@@ -1006,7 +1006,7 @@
               <w:noProof/>
             </w:rPr>
           </w:pPr>
-          <w:hyperlink w:anchor="_Toc241447902" w:history="1">
+          <w:hyperlink w:anchor="_Toc241449963" w:history="1">
             <w:r>
               <w:rPr>
                 <w:rStyle w:val="a5"/>
@@ -1030,7 +1030,7 @@
               <w:rPr>
                 <w:noProof/>
               </w:rPr>
-              <w:instrText xml:space="preserve"> PAGEREF _Toc241447902 \h </w:instrText>
+              <w:instrText xml:space="preserve"> PAGEREF _Toc241449963 \h </w:instrText>
             </w:r>
             <w:r>
               <w:rPr>
@@ -1068,7 +1068,7 @@
               <w:noProof/>
             </w:rPr>
           </w:pPr>
-          <w:hyperlink w:anchor="_Toc241447903" w:history="1">
+          <w:hyperlink w:anchor="_Toc241449964" w:history="1">
             <w:r>
               <w:rPr>
                 <w:rStyle w:val="a5"/>
@@ -1092,7 +1092,7 @@
               <w:rPr>
                 <w:noProof/>
               </w:rPr>
-              <w:instrText xml:space="preserve"> PAGEREF _Toc241447903 \h </w:instrText>
+              <w:instrText xml:space="preserve"> PAGEREF _Toc241449964 \h </w:instrText>
             </w:r>
             <w:r>
               <w:rPr>
@@ -1129,7 +1129,7 @@
               <w:noProof/>
             </w:rPr>
           </w:pPr>
-          <w:hyperlink w:anchor="_Toc241447904" w:history="1">
+          <w:hyperlink w:anchor="_Toc241449965" w:history="1">
             <w:r>
               <w:rPr>
                 <w:rStyle w:val="a5"/>
@@ -1153,7 +1153,7 @@
               <w:rPr>
                 <w:noProof/>
               </w:rPr>
-              <w:instrText xml:space="preserve"> PAGEREF _Toc241447904 \h </w:instrText>
+              <w:instrText xml:space="preserve"> PAGEREF _Toc241449965 \h </w:instrText>
             </w:r>
             <w:r>
               <w:rPr>
@@ -1191,7 +1191,7 @@
               <w:noProof/>
             </w:rPr>
           </w:pPr>
-          <w:hyperlink w:anchor="_Toc241447905" w:history="1">
+          <w:hyperlink w:anchor="_Toc241449966" w:history="1">
             <w:r>
               <w:rPr>
                 <w:rStyle w:val="a5"/>
@@ -1215,7 +1215,7 @@
               <w:rPr>
                 <w:noProof/>
               </w:rPr>
-              <w:instrText xml:space="preserve"> PAGEREF _Toc241447905 \h </w:instrText>
+              <w:instrText xml:space="preserve"> PAGEREF _Toc241449966 \h </w:instrText>
             </w:r>
             <w:r>
               <w:rPr>
@@ -1253,7 +1253,7 @@
               <w:noProof/>
             </w:rPr>
           </w:pPr>
-          <w:hyperlink w:anchor="_Toc241447906" w:history="1">
+          <w:hyperlink w:anchor="_Toc241449967" w:history="1">
             <w:r>
               <w:rPr>
                 <w:rStyle w:val="a5"/>
@@ -1277,7 +1277,7 @@
               <w:rPr>
                 <w:noProof/>
               </w:rPr>
-              <w:instrText xml:space="preserve"> PAGEREF _Toc241447906 \h </w:instrText>
+              <w:instrText xml:space="preserve"> PAGEREF _Toc241449967 \h </w:instrText>
             </w:r>
             <w:r>
               <w:rPr>
@@ -1320,7 +1320,7 @@
       <w:pPr>
         <w:pStyle w:val="1"/>
       </w:pPr>
-      <w:bookmarkStart w:id="1" w:name="_Toc241447889"/>
+      <w:bookmarkStart w:id="1" w:name="_Toc241449950"/>
       <w:r>
         <w:t>For members</w:t>
       </w:r>
@@ -1330,7 +1330,7 @@
       <w:pPr>
         <w:pStyle w:val="2"/>
       </w:pPr>
-      <w:bookmarkStart w:id="2" w:name="_Toc241447890"/>
+      <w:bookmarkStart w:id="2" w:name="_Toc241449951"/>
       <w:r>
         <w:t>About this site</w:t>
       </w:r>
@@ -1396,7 +1396,7 @@
       <w:pPr>
         <w:pStyle w:val="2"/>
       </w:pPr>
-      <w:bookmarkStart w:id="3" w:name="_Toc241447891"/>
+      <w:bookmarkStart w:id="3" w:name="_Toc241449952"/>
       <w:r>
         <w:t>Getting started</w:t>
       </w:r>
@@ -1466,7 +1466,7 @@
           <w:noProof/>
         </w:rPr>
         <w:drawing>
-          <wp:inline distT="0" distB="0" distL="0" distR="0" wp14:anchorId="6AADEF5E" wp14:editId="2DC4DF76">
+          <wp:inline distT="0" distB="0" distL="0" distR="0" wp14:anchorId="455FCEB4" wp14:editId="0789B17A">
             <wp:extent cx="2190750" cy="4743450"/>
             <wp:effectExtent l="0" t="0" r="0" b="0"/>
             <wp:docPr id="1" name="start" descr="Getting started" title="Getting started"/>
@@ -1509,7 +1509,7 @@
       <w:pPr>
         <w:pStyle w:val="2"/>
       </w:pPr>
-      <w:bookmarkStart w:id="4" w:name="_Toc241447892"/>
+      <w:bookmarkStart w:id="4" w:name="_Toc241449953"/>
       <w:r>
         <w:t>Bottom menu</w:t>
       </w:r>
@@ -1822,10 +1822,10 @@
           <w:noProof/>
         </w:rPr>
         <w:drawing>
-          <wp:inline distT="0" distB="0" distL="0" distR="0" wp14:anchorId="74BD846F" wp14:editId="258E9CF9">
+          <wp:inline distT="0" distB="0" distL="0" distR="0" wp14:anchorId="486A3FE1" wp14:editId="2F217B2C">
             <wp:extent cx="2190750" cy="4743450"/>
             <wp:effectExtent l="0" t="0" r="0" b="0"/>
-            <wp:docPr id="288400694" name="menu" descr="Bottom menu" title="Bottom menu"/>
+            <wp:docPr id="784844232" name="menu" descr="Bottom menu" title="Bottom menu"/>
             <wp:cNvGraphicFramePr>
               <a:graphicFrameLocks xmlns:a="http://schemas.openxmlformats.org/drawingml/2006/main" noChangeAspect="1"/>
             </wp:cNvGraphicFramePr>
@@ -1865,7 +1865,7 @@
       <w:pPr>
         <w:pStyle w:val="2"/>
       </w:pPr>
-      <w:bookmarkStart w:id="5" w:name="_Toc241447893"/>
+      <w:bookmarkStart w:id="5" w:name="_Toc241449954"/>
       <w:r>
         <w:t>Daily study</w:t>
       </w:r>
@@ -1917,10 +1917,10 @@
           <w:noProof/>
         </w:rPr>
         <w:drawing>
-          <wp:inline distT="0" distB="0" distL="0" distR="0" wp14:anchorId="6B28BFAA" wp14:editId="154DDA57">
+          <wp:inline distT="0" distB="0" distL="0" distR="0" wp14:anchorId="327F180F" wp14:editId="50CABF74">
             <wp:extent cx="2190750" cy="4743450"/>
             <wp:effectExtent l="0" t="0" r="0" b="0"/>
-            <wp:docPr id="1206367721" name="study" descr="Daily study" title="Daily study"/>
+            <wp:docPr id="117815161" name="study" descr="Daily study" title="Daily study"/>
             <wp:cNvGraphicFramePr>
               <a:graphicFrameLocks xmlns:a="http://schemas.openxmlformats.org/drawingml/2006/main" noChangeAspect="1"/>
             </wp:cNvGraphicFramePr>
@@ -1960,7 +1960,7 @@
       <w:pPr>
         <w:pStyle w:val="2"/>
       </w:pPr>
-      <w:bookmarkStart w:id="6" w:name="_Toc241447894"/>
+      <w:bookmarkStart w:id="6" w:name="_Toc241449955"/>
       <w:r>
         <w:t>Think together (see others' thoughts)</w:t>
       </w:r>
@@ -2051,10 +2051,10 @@
           <w:noProof/>
         </w:rPr>
         <w:drawing>
-          <wp:inline distT="0" distB="0" distL="0" distR="0" wp14:anchorId="66BDFF90" wp14:editId="22022DDA">
+          <wp:inline distT="0" distB="0" distL="0" distR="0" wp14:anchorId="0D1FB456" wp14:editId="14561000">
             <wp:extent cx="2190750" cy="4743450"/>
             <wp:effectExtent l="0" t="0" r="0" b="0"/>
-            <wp:docPr id="2069472034" name="think" descr="Think together (see others' thoughts)" title="Think together (see others' thoughts)"/>
+            <wp:docPr id="672417828" name="think" descr="Think together (see others' thoughts)" title="Think together (see others' thoughts)"/>
             <wp:cNvGraphicFramePr>
               <a:graphicFrameLocks xmlns:a="http://schemas.openxmlformats.org/drawingml/2006/main" noChangeAspect="1"/>
             </wp:cNvGraphicFramePr>
@@ -2094,7 +2094,7 @@
       <w:pPr>
         <w:pStyle w:val="2"/>
       </w:pPr>
-      <w:bookmarkStart w:id="7" w:name="_Toc241447895"/>
+      <w:bookmarkStart w:id="7" w:name="_Toc241449956"/>
       <w:r>
         <w:t>Ward calendar</w:t>
       </w:r>
@@ -2158,10 +2158,10 @@
           <w:noProof/>
         </w:rPr>
         <w:drawing>
-          <wp:inline distT="0" distB="0" distL="0" distR="0" wp14:anchorId="48A5C54F" wp14:editId="1A8F3B9F">
+          <wp:inline distT="0" distB="0" distL="0" distR="0" wp14:anchorId="44B091C9" wp14:editId="44D5B84A">
             <wp:extent cx="2190750" cy="4743450"/>
             <wp:effectExtent l="0" t="0" r="0" b="0"/>
-            <wp:docPr id="1495667883" name="ward" descr="Ward calendar" title="Ward calendar"/>
+            <wp:docPr id="1821105133" name="ward" descr="Ward calendar" title="Ward calendar"/>
             <wp:cNvGraphicFramePr>
               <a:graphicFrameLocks xmlns:a="http://schemas.openxmlformats.org/drawingml/2006/main" noChangeAspect="1"/>
             </wp:cNvGraphicFramePr>
@@ -2201,7 +2201,7 @@
       <w:pPr>
         <w:pStyle w:val="2"/>
       </w:pPr>
-      <w:bookmarkStart w:id="8" w:name="_Toc241447896"/>
+      <w:bookmarkStart w:id="8" w:name="_Toc241449957"/>
       <w:r>
         <w:t>Add to your phone's home screen</w:t>
       </w:r>
@@ -2235,7 +2235,7 @@
       <w:pPr>
         <w:pStyle w:val="2"/>
       </w:pPr>
-      <w:bookmarkStart w:id="9" w:name="_Toc241447897"/>
+      <w:bookmarkStart w:id="9" w:name="_Toc241449958"/>
       <w:r>
         <w:t>Viewing in other languages</w:t>
       </w:r>
@@ -2319,10 +2319,10 @@
           <w:noProof/>
         </w:rPr>
         <w:drawing>
-          <wp:inline distT="0" distB="0" distL="0" distR="0" wp14:anchorId="03EF0706" wp14:editId="03ED36DE">
+          <wp:inline distT="0" distB="0" distL="0" distR="0" wp14:anchorId="560BDAC7" wp14:editId="1FD4F3B7">
             <wp:extent cx="2190750" cy="4743450"/>
             <wp:effectExtent l="0" t="0" r="0" b="0"/>
-            <wp:docPr id="733012805" name="other-languages" descr="Viewing in other languages" title="Viewing in other languages"/>
+            <wp:docPr id="1984065951" name="other-languages" descr="Viewing in other languages" title="Viewing in other languages"/>
             <wp:cNvGraphicFramePr>
               <a:graphicFrameLocks xmlns:a="http://schemas.openxmlformats.org/drawingml/2006/main" noChangeAspect="1"/>
             </wp:cNvGraphicFramePr>
@@ -2362,7 +2362,7 @@
       <w:pPr>
         <w:pStyle w:val="2"/>
       </w:pPr>
-      <w:bookmarkStart w:id="10" w:name="_Toc241447898"/>
+      <w:bookmarkStart w:id="10" w:name="_Toc241449959"/>
       <w:r>
         <w:t>Reading scripture right in the site</w:t>
       </w:r>
@@ -2429,10 +2429,10 @@
           <w:noProof/>
         </w:rPr>
         <w:drawing>
-          <wp:inline distT="0" distB="0" distL="0" distR="0" wp14:anchorId="3E5E9347" wp14:editId="4D44E036">
+          <wp:inline distT="0" distB="0" distL="0" distR="0" wp14:anchorId="47966AC7" wp14:editId="708B3014">
             <wp:extent cx="2190750" cy="4743450"/>
             <wp:effectExtent l="0" t="0" r="0" b="0"/>
-            <wp:docPr id="1941321973" name="scripture-reader" descr="Reading scripture right in the site" title="Reading scripture right in the site"/>
+            <wp:docPr id="88948934" name="scripture-reader" descr="Reading scripture right in the site" title="Reading scripture right in the site"/>
             <wp:cNvGraphicFramePr>
               <a:graphicFrameLocks xmlns:a="http://schemas.openxmlformats.org/drawingml/2006/main" noChangeAspect="1"/>
             </wp:cNvGraphicFramePr>
@@ -2472,7 +2472,7 @@
       <w:pPr>
         <w:pStyle w:val="2"/>
       </w:pPr>
-      <w:bookmarkStart w:id="11" w:name="_Toc241447899"/>
+      <w:bookmarkStart w:id="11" w:name="_Toc241449960"/>
       <w:r>
         <w:t>Today's insight card</w:t>
       </w:r>
@@ -2517,10 +2517,10 @@
           <w:noProof/>
         </w:rPr>
         <w:drawing>
-          <wp:inline distT="0" distB="0" distL="0" distR="0" wp14:anchorId="665A5427" wp14:editId="325B4285">
+          <wp:inline distT="0" distB="0" distL="0" distR="0" wp14:anchorId="26C05CAA" wp14:editId="3CAFA0BA">
             <wp:extent cx="2190750" cy="4743450"/>
             <wp:effectExtent l="0" t="0" r="0" b="0"/>
-            <wp:docPr id="1775333404" name="daily-insight" descr="Today's insight card" title="Today's insight card"/>
+            <wp:docPr id="599498230" name="daily-insight" descr="Today's insight card" title="Today's insight card"/>
             <wp:cNvGraphicFramePr>
               <a:graphicFrameLocks xmlns:a="http://schemas.openxmlformats.org/drawingml/2006/main" noChangeAspect="1"/>
             </wp:cNvGraphicFramePr>
@@ -2560,7 +2560,7 @@
       <w:pPr>
         <w:pStyle w:val="2"/>
       </w:pPr>
-      <w:bookmarkStart w:id="12" w:name="_Toc241447900"/>
+      <w:bookmarkStart w:id="12" w:name="_Toc241449961"/>
       <w:r>
         <w:t>Saving a reply as a card image</w:t>
       </w:r>
@@ -2612,10 +2612,10 @@
           <w:noProof/>
         </w:rPr>
         <w:drawing>
-          <wp:inline distT="0" distB="0" distL="0" distR="0" wp14:anchorId="7213C6CC" wp14:editId="7BBE822E">
+          <wp:inline distT="0" distB="0" distL="0" distR="0" wp14:anchorId="38B5D789" wp14:editId="331A860D">
             <wp:extent cx="2190750" cy="4743450"/>
             <wp:effectExtent l="0" t="0" r="0" b="0"/>
-            <wp:docPr id="1110778121" name="cards" descr="Saving a reply as a card image" title="Saving a reply as a card image"/>
+            <wp:docPr id="2034184481" name="cards" descr="Saving a reply as a card image" title="Saving a reply as a card image"/>
             <wp:cNvGraphicFramePr>
               <a:graphicFrameLocks xmlns:a="http://schemas.openxmlformats.org/drawingml/2006/main" noChangeAspect="1"/>
             </wp:cNvGraphicFramePr>
@@ -2655,7 +2655,7 @@
       <w:pPr>
         <w:pStyle w:val="2"/>
       </w:pPr>
-      <w:bookmarkStart w:id="13" w:name="_Toc241447901"/>
+      <w:bookmarkStart w:id="13" w:name="_Toc241449962"/>
       <w:r>
         <w:t>Notes on a verse</w:t>
       </w:r>
@@ -2707,10 +2707,10 @@
           <w:noProof/>
         </w:rPr>
         <w:drawing>
-          <wp:inline distT="0" distB="0" distL="0" distR="0" wp14:anchorId="56952B80" wp14:editId="33B2B307">
+          <wp:inline distT="0" distB="0" distL="0" distR="0" wp14:anchorId="1B956E0D" wp14:editId="4EABAD95">
             <wp:extent cx="2190750" cy="4743450"/>
             <wp:effectExtent l="0" t="0" r="0" b="0"/>
-            <wp:docPr id="1266010947" name="verse-notes" descr="Notes on a verse" title="Notes on a verse"/>
+            <wp:docPr id="1573531603" name="verse-notes" descr="Notes on a verse" title="Notes on a verse"/>
             <wp:cNvGraphicFramePr>
               <a:graphicFrameLocks xmlns:a="http://schemas.openxmlformats.org/drawingml/2006/main" noChangeAspect="1"/>
             </wp:cNvGraphicFramePr>
@@ -2750,7 +2750,7 @@
       <w:pPr>
         <w:pStyle w:val="2"/>
       </w:pPr>
-      <w:bookmarkStart w:id="14" w:name="_Toc241447902"/>
+      <w:bookmarkStart w:id="14" w:name="_Toc241449963"/>
       <w:r>
         <w:t>Highlights and notes on the lesson text</w:t>
       </w:r>
@@ -2807,10 +2807,10 @@
           <w:noProof/>
         </w:rPr>
         <w:drawing>
-          <wp:inline distT="0" distB="0" distL="0" distR="0" wp14:anchorId="698AF21A" wp14:editId="1276B221">
+          <wp:inline distT="0" distB="0" distL="0" distR="0" wp14:anchorId="2B2F0432" wp14:editId="45C0CE8D">
             <wp:extent cx="2190750" cy="4743450"/>
             <wp:effectExtent l="0" t="0" r="0" b="0"/>
-            <wp:docPr id="1851267310" name="text-notes" descr="Highlights and notes on the lesson text" title="Highlights and notes on the lesson text"/>
+            <wp:docPr id="1823380270" name="text-notes" descr="Highlights and notes on the lesson text" title="Highlights and notes on the lesson text"/>
             <wp:cNvGraphicFramePr>
               <a:graphicFrameLocks xmlns:a="http://schemas.openxmlformats.org/drawingml/2006/main" noChangeAspect="1"/>
             </wp:cNvGraphicFramePr>
@@ -2850,7 +2850,7 @@
       <w:pPr>
         <w:pStyle w:val="2"/>
       </w:pPr>
-      <w:bookmarkStart w:id="15" w:name="_Toc241447903"/>
+      <w:bookmarkStart w:id="15" w:name="_Toc241449964"/>
       <w:r>
         <w:t>Installing, updating and removing the Android app</w:t>
       </w:r>
@@ -2957,7 +2957,7 @@
       <w:pPr>
         <w:pStyle w:val="1"/>
       </w:pPr>
-      <w:bookmarkStart w:id="16" w:name="_Toc241447904"/>
+      <w:bookmarkStart w:id="16" w:name="_Toc241449965"/>
       <w:r>
         <w:t>Help</w:t>
       </w:r>
@@ -2967,7 +2967,7 @@
       <w:pPr>
         <w:pStyle w:val="2"/>
       </w:pPr>
-      <w:bookmarkStart w:id="17" w:name="_Toc241447905"/>
+      <w:bookmarkStart w:id="17" w:name="_Toc241449966"/>
       <w:r>
         <w:t>Common problems</w:t>
       </w:r>
@@ -3266,7 +3266,7 @@
       <w:pPr>
         <w:pStyle w:val="2"/>
       </w:pPr>
-      <w:bookmarkStart w:id="18" w:name="_Toc241447906"/>
+      <w:bookmarkStart w:id="18" w:name="_Toc241449967"/>
       <w:r>
         <w:t>Privacy and records</w:t>
       </w:r>
@@ -3431,96 +3431,10 @@
 <file path=word/numbering.xml><?xml version="1.0" encoding="utf-8"?>
 <w:numbering xmlns:wpc="http://schemas.microsoft.com/office/word/2010/wordprocessingCanvas" xmlns:cx="http://schemas.microsoft.com/office/drawing/2014/chartex" xmlns:cx1="http://schemas.microsoft.com/office/drawing/2015/9/8/chartex" xmlns:cx2="http://schemas.microsoft.com/office/drawing/2015/10/21/chartex" xmlns:cx3="http://schemas.microsoft.com/office/drawing/2016/5/9/chartex" xmlns:cx4="http://schemas.microsoft.com/office/drawing/2016/5/10/chartex" xmlns:cx5="http://schemas.microsoft.com/office/drawing/2016/5/11/chartex" xmlns:cx6="http://schemas.microsoft.com/office/drawing/2016/5/12/chartex" xmlns:cx7="http://schemas.microsoft.com/office/drawing/2016/5/13/chartex" xmlns:cx8="http://schemas.microsoft.com/office/drawing/2016/5/14/chartex" xmlns:mc="http://schemas.openxmlformats.org/markup-compatibility/2006" xmlns:aink="http://schemas.microsoft.com/office/drawing/2016/ink" xmlns:am3d="http://schemas.microsoft.com/office/drawing/2017/model3d" xmlns:o="urn:schemas-microsoft-com:office:office" xmlns:oel="http://schemas.microsoft.com/office/2019/extlst" xmlns:r="http://schemas.openxmlformats.org/officeDocument/2006/relationships" xmlns:m="http://schemas.openxmlformats.org/officeDocument/2006/math" xmlns:v="urn:schemas-microsoft-com:vml" xmlns:wp14="http://schemas.microsoft.com/office/word/2010/wordprocessingDrawing" xmlns:wp="http://schemas.openxmlformats.org/drawingml/2006/wordprocessingDrawing" xmlns:w10="urn:schemas-microsoft-com:office:word" xmlns:w="http://schemas.openxmlformats.org/wordprocessingml/2006/main" xmlns:w14="http://schemas.microsoft.com/office/word/2010/wordml" xmlns:w15="http://schemas.microsoft.com/office/word/2012/wordml" xmlns:w16cex="http://schemas.microsoft.com/office/word/2018/wordml/cex" xmlns:w16cid="http://schemas.microsoft.com/office/word/2016/wordml/cid" xmlns:w16="http://schemas.microsoft.com/office/word/2018/wordml" xmlns:w16du="http://schemas.microsoft.com/office/word/2023/wordml/word16du" xmlns:w16sdtdh="http://schemas.microsoft.com/office/word/2020/wordml/sdtdatahash" xmlns:w16sdtfl="http://schemas.microsoft.com/office/word/2024/wordml/sdtformatlock" xmlns:w16se="http://schemas.microsoft.com/office/word/2015/wordml/symex" xmlns:wpg="http://schemas.microsoft.com/office/word/2010/wordprocessingGroup" xmlns:wpi="http://schemas.microsoft.com/office/word/2010/wordprocessingInk" xmlns:wne="http://schemas.microsoft.com/office/word/2006/wordml" xmlns:wps="http://schemas.microsoft.com/office/word/2010/wordprocessingShape" mc:Ignorable="w14 w15 w16se w16cid w16 w16cex w16sdtdh w16sdtfl w16du wp14">
   <w:abstractNum w:abstractNumId="0" w15:restartNumberingAfterBreak="0">
-    <w:nsid w:val="40F93F29"/>
+    <w:nsid w:val="29380ED2"/>
     <w:multiLevelType w:val="hybridMultilevel"/>
-    <w:tmpl w:val="976485E2"/>
-    <w:lvl w:ilvl="0" w:tplc="C090D05C">
-      <w:start w:val="1"/>
-      <w:numFmt w:val="bullet"/>
-      <w:lvlText w:val="●"/>
-      <w:lvlJc w:val="left"/>
-      <w:pPr>
-        <w:ind w:left="720" w:hanging="360"/>
-      </w:pPr>
-    </w:lvl>
-    <w:lvl w:ilvl="1" w:tplc="0C32347E">
-      <w:start w:val="1"/>
-      <w:numFmt w:val="bullet"/>
-      <w:lvlText w:val="○"/>
-      <w:lvlJc w:val="left"/>
-      <w:pPr>
-        <w:ind w:left="1440" w:hanging="360"/>
-      </w:pPr>
-    </w:lvl>
-    <w:lvl w:ilvl="2" w:tplc="21702818">
-      <w:start w:val="1"/>
-      <w:numFmt w:val="bullet"/>
-      <w:lvlText w:val="■"/>
-      <w:lvlJc w:val="left"/>
-      <w:pPr>
-        <w:ind w:left="2160" w:hanging="360"/>
-      </w:pPr>
-    </w:lvl>
-    <w:lvl w:ilvl="3" w:tplc="9C4C8D16">
-      <w:start w:val="1"/>
-      <w:numFmt w:val="bullet"/>
-      <w:lvlText w:val="●"/>
-      <w:lvlJc w:val="left"/>
-      <w:pPr>
-        <w:ind w:left="2880" w:hanging="360"/>
-      </w:pPr>
-    </w:lvl>
-    <w:lvl w:ilvl="4" w:tplc="231C3892">
-      <w:start w:val="1"/>
-      <w:numFmt w:val="bullet"/>
-      <w:lvlText w:val="○"/>
-      <w:lvlJc w:val="left"/>
-      <w:pPr>
-        <w:ind w:left="3600" w:hanging="360"/>
-      </w:pPr>
-    </w:lvl>
-    <w:lvl w:ilvl="5" w:tplc="96CE0200">
-      <w:start w:val="1"/>
-      <w:numFmt w:val="bullet"/>
-      <w:lvlText w:val="■"/>
-      <w:lvlJc w:val="left"/>
-      <w:pPr>
-        <w:ind w:left="4320" w:hanging="360"/>
-      </w:pPr>
-    </w:lvl>
-    <w:lvl w:ilvl="6" w:tplc="0BD08642">
-      <w:start w:val="1"/>
-      <w:numFmt w:val="bullet"/>
-      <w:lvlText w:val="●"/>
-      <w:lvlJc w:val="left"/>
-      <w:pPr>
-        <w:ind w:left="5040" w:hanging="360"/>
-      </w:pPr>
-    </w:lvl>
-    <w:lvl w:ilvl="7" w:tplc="F140B9A2">
-      <w:start w:val="1"/>
-      <w:numFmt w:val="bullet"/>
-      <w:lvlText w:val="●"/>
-      <w:lvlJc w:val="left"/>
-      <w:pPr>
-        <w:ind w:left="5760" w:hanging="360"/>
-      </w:pPr>
-    </w:lvl>
-    <w:lvl w:ilvl="8" w:tplc="107814BA">
-      <w:start w:val="1"/>
-      <w:numFmt w:val="bullet"/>
-      <w:lvlText w:val="●"/>
-      <w:lvlJc w:val="left"/>
-      <w:pPr>
-        <w:ind w:left="6480" w:hanging="360"/>
-      </w:pPr>
-    </w:lvl>
-  </w:abstractNum>
-  <w:abstractNum w:abstractNumId="1" w15:restartNumberingAfterBreak="0">
-    <w:nsid w:val="5A135831"/>
-    <w:multiLevelType w:val="hybridMultilevel"/>
-    <w:tmpl w:val="1C960BF8"/>
-    <w:lvl w:ilvl="0" w:tplc="7966BE02">
+    <w:tmpl w:val="6CA43EBA"/>
+    <w:lvl w:ilvl="0" w:tplc="F96A16A4">
       <w:start w:val="1"/>
       <w:numFmt w:val="decimal"/>
       <w:lvlText w:val="%1."/>
@@ -3529,133 +3443,219 @@
         <w:ind w:left="540" w:hanging="360"/>
       </w:pPr>
     </w:lvl>
-    <w:lvl w:ilvl="1" w:tplc="F912C770">
+    <w:lvl w:ilvl="1" w:tplc="E93C3128">
       <w:numFmt w:val="decimal"/>
       <w:lvlText w:val=""/>
       <w:lvlJc w:val="left"/>
     </w:lvl>
-    <w:lvl w:ilvl="2" w:tplc="9ECC8632">
+    <w:lvl w:ilvl="2" w:tplc="1316B7CE">
       <w:numFmt w:val="decimal"/>
       <w:lvlText w:val=""/>
       <w:lvlJc w:val="left"/>
     </w:lvl>
-    <w:lvl w:ilvl="3" w:tplc="B500547E">
+    <w:lvl w:ilvl="3" w:tplc="009A8776">
       <w:numFmt w:val="decimal"/>
       <w:lvlText w:val=""/>
       <w:lvlJc w:val="left"/>
     </w:lvl>
-    <w:lvl w:ilvl="4" w:tplc="E666946E">
+    <w:lvl w:ilvl="4" w:tplc="353A6BBA">
       <w:numFmt w:val="decimal"/>
       <w:lvlText w:val=""/>
       <w:lvlJc w:val="left"/>
     </w:lvl>
-    <w:lvl w:ilvl="5" w:tplc="B3787216">
+    <w:lvl w:ilvl="5" w:tplc="50CCFD54">
       <w:numFmt w:val="decimal"/>
       <w:lvlText w:val=""/>
       <w:lvlJc w:val="left"/>
     </w:lvl>
-    <w:lvl w:ilvl="6" w:tplc="38B4A290">
+    <w:lvl w:ilvl="6" w:tplc="2FAC5F3E">
       <w:numFmt w:val="decimal"/>
       <w:lvlText w:val=""/>
       <w:lvlJc w:val="left"/>
     </w:lvl>
-    <w:lvl w:ilvl="7" w:tplc="D5CC8D2E">
+    <w:lvl w:ilvl="7" w:tplc="57BC21A6">
       <w:numFmt w:val="decimal"/>
       <w:lvlText w:val=""/>
       <w:lvlJc w:val="left"/>
     </w:lvl>
-    <w:lvl w:ilvl="8" w:tplc="94D42D92">
+    <w:lvl w:ilvl="8" w:tplc="2EC6EEA0">
       <w:numFmt w:val="decimal"/>
       <w:lvlText w:val=""/>
       <w:lvlJc w:val="left"/>
     </w:lvl>
   </w:abstractNum>
-  <w:num w:numId="1" w16cid:durableId="248586395">
+  <w:abstractNum w:abstractNumId="1" w15:restartNumberingAfterBreak="0">
+    <w:nsid w:val="56025F42"/>
+    <w:multiLevelType w:val="hybridMultilevel"/>
+    <w:tmpl w:val="6840D60C"/>
+    <w:lvl w:ilvl="0" w:tplc="2AC06490">
+      <w:start w:val="1"/>
+      <w:numFmt w:val="bullet"/>
+      <w:lvlText w:val="●"/>
+      <w:lvlJc w:val="left"/>
+      <w:pPr>
+        <w:ind w:left="720" w:hanging="360"/>
+      </w:pPr>
+    </w:lvl>
+    <w:lvl w:ilvl="1" w:tplc="40FEAEE4">
+      <w:start w:val="1"/>
+      <w:numFmt w:val="bullet"/>
+      <w:lvlText w:val="○"/>
+      <w:lvlJc w:val="left"/>
+      <w:pPr>
+        <w:ind w:left="1440" w:hanging="360"/>
+      </w:pPr>
+    </w:lvl>
+    <w:lvl w:ilvl="2" w:tplc="E918E71A">
+      <w:start w:val="1"/>
+      <w:numFmt w:val="bullet"/>
+      <w:lvlText w:val="■"/>
+      <w:lvlJc w:val="left"/>
+      <w:pPr>
+        <w:ind w:left="2160" w:hanging="360"/>
+      </w:pPr>
+    </w:lvl>
+    <w:lvl w:ilvl="3" w:tplc="5B12183C">
+      <w:start w:val="1"/>
+      <w:numFmt w:val="bullet"/>
+      <w:lvlText w:val="●"/>
+      <w:lvlJc w:val="left"/>
+      <w:pPr>
+        <w:ind w:left="2880" w:hanging="360"/>
+      </w:pPr>
+    </w:lvl>
+    <w:lvl w:ilvl="4" w:tplc="05B8CE12">
+      <w:start w:val="1"/>
+      <w:numFmt w:val="bullet"/>
+      <w:lvlText w:val="○"/>
+      <w:lvlJc w:val="left"/>
+      <w:pPr>
+        <w:ind w:left="3600" w:hanging="360"/>
+      </w:pPr>
+    </w:lvl>
+    <w:lvl w:ilvl="5" w:tplc="16EA949C">
+      <w:start w:val="1"/>
+      <w:numFmt w:val="bullet"/>
+      <w:lvlText w:val="■"/>
+      <w:lvlJc w:val="left"/>
+      <w:pPr>
+        <w:ind w:left="4320" w:hanging="360"/>
+      </w:pPr>
+    </w:lvl>
+    <w:lvl w:ilvl="6" w:tplc="95B4AB4E">
+      <w:start w:val="1"/>
+      <w:numFmt w:val="bullet"/>
+      <w:lvlText w:val="●"/>
+      <w:lvlJc w:val="left"/>
+      <w:pPr>
+        <w:ind w:left="5040" w:hanging="360"/>
+      </w:pPr>
+    </w:lvl>
+    <w:lvl w:ilvl="7" w:tplc="5CAE064E">
+      <w:start w:val="1"/>
+      <w:numFmt w:val="bullet"/>
+      <w:lvlText w:val="●"/>
+      <w:lvlJc w:val="left"/>
+      <w:pPr>
+        <w:ind w:left="5760" w:hanging="360"/>
+      </w:pPr>
+    </w:lvl>
+    <w:lvl w:ilvl="8" w:tplc="1C343A02">
+      <w:start w:val="1"/>
+      <w:numFmt w:val="bullet"/>
+      <w:lvlText w:val="●"/>
+      <w:lvlJc w:val="left"/>
+      <w:pPr>
+        <w:ind w:left="6480" w:hanging="360"/>
+      </w:pPr>
+    </w:lvl>
+  </w:abstractNum>
+  <w:num w:numId="1" w16cid:durableId="988291847">
+    <w:abstractNumId w:val="1"/>
+    <w:lvlOverride w:ilvl="0">
+      <w:startOverride w:val="1"/>
+    </w:lvlOverride>
+  </w:num>
+  <w:num w:numId="2" w16cid:durableId="977077917">
     <w:abstractNumId w:val="0"/>
     <w:lvlOverride w:ilvl="0">
       <w:startOverride w:val="1"/>
     </w:lvlOverride>
   </w:num>
-  <w:num w:numId="2" w16cid:durableId="2082605363">
-    <w:abstractNumId w:val="1"/>
+  <w:num w:numId="3" w16cid:durableId="1071732284">
+    <w:abstractNumId w:val="0"/>
     <w:lvlOverride w:ilvl="0">
       <w:startOverride w:val="1"/>
     </w:lvlOverride>
   </w:num>
-  <w:num w:numId="3" w16cid:durableId="1640720453">
-    <w:abstractNumId w:val="1"/>
+  <w:num w:numId="4" w16cid:durableId="1593081497">
+    <w:abstractNumId w:val="0"/>
     <w:lvlOverride w:ilvl="0">
       <w:startOverride w:val="1"/>
     </w:lvlOverride>
   </w:num>
-  <w:num w:numId="4" w16cid:durableId="735904592">
-    <w:abstractNumId w:val="1"/>
+  <w:num w:numId="5" w16cid:durableId="1767379621">
+    <w:abstractNumId w:val="0"/>
     <w:lvlOverride w:ilvl="0">
       <w:startOverride w:val="1"/>
     </w:lvlOverride>
   </w:num>
-  <w:num w:numId="5" w16cid:durableId="559823922">
-    <w:abstractNumId w:val="1"/>
+  <w:num w:numId="6" w16cid:durableId="306740099">
+    <w:abstractNumId w:val="0"/>
     <w:lvlOverride w:ilvl="0">
       <w:startOverride w:val="1"/>
     </w:lvlOverride>
   </w:num>
-  <w:num w:numId="6" w16cid:durableId="618680848">
-    <w:abstractNumId w:val="1"/>
+  <w:num w:numId="7" w16cid:durableId="2049530531">
+    <w:abstractNumId w:val="0"/>
     <w:lvlOverride w:ilvl="0">
       <w:startOverride w:val="1"/>
     </w:lvlOverride>
   </w:num>
-  <w:num w:numId="7" w16cid:durableId="129785329">
-    <w:abstractNumId w:val="1"/>
+  <w:num w:numId="8" w16cid:durableId="549264795">
+    <w:abstractNumId w:val="0"/>
     <w:lvlOverride w:ilvl="0">
       <w:startOverride w:val="1"/>
     </w:lvlOverride>
   </w:num>
-  <w:num w:numId="8" w16cid:durableId="1185095816">
-    <w:abstractNumId w:val="1"/>
+  <w:num w:numId="9" w16cid:durableId="2049643256">
+    <w:abstractNumId w:val="0"/>
     <w:lvlOverride w:ilvl="0">
       <w:startOverride w:val="1"/>
     </w:lvlOverride>
   </w:num>
-  <w:num w:numId="9" w16cid:durableId="233006434">
-    <w:abstractNumId w:val="1"/>
+  <w:num w:numId="10" w16cid:durableId="1849170222">
+    <w:abstractNumId w:val="0"/>
     <w:lvlOverride w:ilvl="0">
       <w:startOverride w:val="1"/>
     </w:lvlOverride>
   </w:num>
-  <w:num w:numId="10" w16cid:durableId="1954634777">
-    <w:abstractNumId w:val="1"/>
+  <w:num w:numId="11" w16cid:durableId="498733068">
+    <w:abstractNumId w:val="0"/>
     <w:lvlOverride w:ilvl="0">
       <w:startOverride w:val="1"/>
     </w:lvlOverride>
   </w:num>
-  <w:num w:numId="11" w16cid:durableId="2092695816">
-    <w:abstractNumId w:val="1"/>
+  <w:num w:numId="12" w16cid:durableId="1664311146">
+    <w:abstractNumId w:val="0"/>
     <w:lvlOverride w:ilvl="0">
       <w:startOverride w:val="1"/>
     </w:lvlOverride>
   </w:num>
-  <w:num w:numId="12" w16cid:durableId="1746609258">
-    <w:abstractNumId w:val="1"/>
+  <w:num w:numId="13" w16cid:durableId="1625690724">
+    <w:abstractNumId w:val="0"/>
     <w:lvlOverride w:ilvl="0">
       <w:startOverride w:val="1"/>
     </w:lvlOverride>
   </w:num>
-  <w:num w:numId="13" w16cid:durableId="2106799731">
-    <w:abstractNumId w:val="1"/>
+  <w:num w:numId="14" w16cid:durableId="1194660603">
+    <w:abstractNumId w:val="0"/>
     <w:lvlOverride w:ilvl="0">
       <w:startOverride w:val="1"/>
     </w:lvlOverride>
   </w:num>
-  <w:num w:numId="14" w16cid:durableId="117527674">
-    <w:abstractNumId w:val="1"/>
-    <w:lvlOverride w:ilvl="0">
-      <w:startOverride w:val="1"/>
-    </w:lvlOverride>
-  </w:num>
-  <w:num w:numId="15" w16cid:durableId="757099485">
-    <w:abstractNumId w:val="1"/>
+  <w:num w:numId="15" w16cid:durableId="1321077937">
+    <w:abstractNumId w:val="0"/>
     <w:lvlOverride w:ilvl="0">
       <w:startOverride w:val="1"/>
     </w:lvlOverride>
@@ -4290,7 +4290,7 @@
     <w:link w:val="Char1"/>
     <w:uiPriority w:val="99"/>
     <w:unhideWhenUsed/>
-    <w:rsid w:val="00224CEA"/>
+    <w:rsid w:val="007C08FA"/>
     <w:pPr>
       <w:tabs>
         <w:tab w:val="center" w:pos="4513"/>
@@ -4304,7 +4304,7 @@
     <w:basedOn w:val="a0"/>
     <w:link w:val="aa"/>
     <w:uiPriority w:val="99"/>
-    <w:rsid w:val="00224CEA"/>
+    <w:rsid w:val="007C08FA"/>
   </w:style>
   <w:style w:type="paragraph" w:styleId="ab">
     <w:name w:val="footer"/>
@@ -4312,7 +4312,7 @@
     <w:link w:val="Char2"/>
     <w:uiPriority w:val="99"/>
     <w:unhideWhenUsed/>
-    <w:rsid w:val="00224CEA"/>
+    <w:rsid w:val="007C08FA"/>
     <w:pPr>
       <w:tabs>
         <w:tab w:val="center" w:pos="4513"/>
@@ -4326,7 +4326,7 @@
     <w:basedOn w:val="a0"/>
     <w:link w:val="ab"/>
     <w:uiPriority w:val="99"/>
-    <w:rsid w:val="00224CEA"/>
+    <w:rsid w:val="007C08FA"/>
   </w:style>
   <w:style w:type="paragraph" w:styleId="11">
     <w:name w:val="toc 1"/>
@@ -4335,7 +4335,7 @@
     <w:autoRedefine/>
     <w:uiPriority w:val="39"/>
     <w:unhideWhenUsed/>
-    <w:rsid w:val="00224CEA"/>
+    <w:rsid w:val="007C08FA"/>
   </w:style>
   <w:style w:type="paragraph" w:styleId="20">
     <w:name w:val="toc 2"/>
@@ -4344,7 +4344,7 @@
     <w:autoRedefine/>
     <w:uiPriority w:val="39"/>
     <w:unhideWhenUsed/>
-    <w:rsid w:val="00224CEA"/>
+    <w:rsid w:val="007C08FA"/>
     <w:pPr>
       <w:ind w:leftChars="200" w:left="425"/>
     </w:pPr>

</xml_diff>